<commit_message>
Combine data flow and BEFORE/AFTER into one image. Update email and docx to reference single combined attachment.
</commit_message>
<xml_diff>
--- a/deliverables/PAX_1391_Coding_Walkthrough_SCH-1024.docx
+++ b/deliverables/PAX_1391_Coding_Walkthrough_SCH-1024.docx
@@ -100,7 +100,7 @@
         <w:rPr>
           <w:sz w:val="22"/>
         </w:rPr>
-        <w:t>This is the line-item list. Columns are Item, UM, Quantity, Unit Cost, and Cost ($000). The toolbar above the table has buttons for Add, Delete, Dollar item, and Percent item. The first row is the iNFADS-supplied building line. PAX populates Item, Classification of Work, Work Type, UM, and Quantity from the iNFADS property record and that row cannot be edited by the operator. Below it the operator adds rows.</w:t>
+        <w:t>This is the line-item list. Columns are ID, Description, Classification of Work, Work Type, UM, Quantity, Unit Cost, and Total Cost ($000). The toolbar above the table has buttons for Add, Delete, Dollar item, and Percent item. The first row is the iNFADS-supplied building line. PAX populates Description, Classification of Work, Work Type, UM, and Quantity from the iNFADS property record and that row cannot be edited by the operator. Below it the operator adds rows.</w:t>
       </w:r>
     </w:p>
     <w:p>
@@ -291,7 +291,7 @@
         <w:rPr>
           <w:sz w:val="22"/>
         </w:rPr>
-        <w:t>The methodology call goes to Bil before PAX entry.</w:t>
+        <w:t>The methodology call goes to the team before PAX entry.</w:t>
       </w:r>
     </w:p>
     <w:p>
@@ -302,7 +302,7 @@
         <w:rPr>
           <w:color w:val="0B5394"/>
         </w:rPr>
-        <w:t>BEFORE and AFTER</w:t>
+        <w:t>Data flow and BEFORE / AFTER</w:t>
       </w:r>
     </w:p>
     <w:p>
@@ -310,7 +310,7 @@
         <w:rPr>
           <w:sz w:val="22"/>
         </w:rPr>
-        <w:t>The image below shows the current SCH-1024 entry next to the proposed entry. Same dollar values. Different entry method.</w:t>
+        <w:t>The diagram below has two parts. The top half shows where each piece of data comes from, where the operator enters it in PAX, and where it lands on the printed form. The bottom half shows the SCH-1024 entry side by side, before and after the proposed change.</w:t>
       </w:r>
     </w:p>
     <w:p>
@@ -320,7 +320,7 @@
       <w:r>
         <w:drawing>
           <wp:inline xmlns:a="http://schemas.openxmlformats.org/drawingml/2006/main" xmlns:pic="http://schemas.openxmlformats.org/drawingml/2006/picture">
-            <wp:extent cx="6035040" cy="4732513"/>
+            <wp:extent cx="6035040" cy="7655185"/>
             <wp:docPr id="1" name="Picture 1"/>
             <wp:cNvGraphicFramePr>
               <a:graphicFrameLocks noChangeAspect="1"/>
@@ -329,7 +329,7 @@
               <a:graphicData uri="http://schemas.openxmlformats.org/drawingml/2006/picture">
                 <pic:pic>
                   <pic:nvPicPr>
-                    <pic:cNvPr id="0" name="PAX_BEFORE_AFTER.png"/>
+                    <pic:cNvPr id="0" name="PAX_BLOCK9_FLOW_AND_BEFORE_AFTER.png"/>
                     <pic:cNvPicPr/>
                   </pic:nvPicPr>
                   <pic:blipFill>
@@ -341,7 +341,7 @@
                   <pic:spPr>
                     <a:xfrm>
                       <a:off x="0" y="0"/>
-                      <a:ext cx="6035040" cy="4732513"/>
+                      <a:ext cx="6035040" cy="7655185"/>
                     </a:xfrm>
                     <a:prstGeom prst="rect"/>
                   </pic:spPr>

</xml_diff>